<commit_message>
docs: retune Tung Ngai thank-you toward career and service
Drop the research paragraph. Keep the Gannan service opening.
Widen the close beyond mentorship into Hong Kong and Mainland work.

Co-authored-by: Shen Ruililin <bobshenruililin@users.noreply.github.com>
</commit_message>
<xml_diff>
--- a/docs/writing-voice/outputs/tung-ngai-thank-you-letter-2026.docx
+++ b/docs/writing-voice/outputs/tung-ngai-thank-you-letter-2026.docx
@@ -11,6 +11,7 @@
         <w:rPr>
           <w:rFonts w:ascii="Times New Roman" w:hAnsi="Times New Roman"/>
           <w:b w:val="0"/>
+          <w:i w:val="0"/>
           <w:sz w:val="24"/>
         </w:rPr>
         <w:t>SHEN Ruililin</w:t>
@@ -25,6 +26,7 @@
         <w:rPr>
           <w:rFonts w:ascii="Times New Roman" w:hAnsi="Times New Roman"/>
           <w:b w:val="0"/>
+          <w:i w:val="0"/>
           <w:sz w:val="24"/>
         </w:rPr>
         <w:t>University Number: 3036484434</w:t>
@@ -39,6 +41,7 @@
         <w:rPr>
           <w:rFonts w:ascii="Times New Roman" w:hAnsi="Times New Roman"/>
           <w:b w:val="0"/>
+          <w:i w:val="0"/>
           <w:sz w:val="24"/>
         </w:rPr>
         <w:t>Bachelor of Arts and Sciences in Global Health and Development</w:t>
@@ -53,6 +56,7 @@
         <w:rPr>
           <w:rFonts w:ascii="Times New Roman" w:hAnsi="Times New Roman"/>
           <w:b w:val="0"/>
+          <w:i w:val="0"/>
           <w:sz w:val="24"/>
         </w:rPr>
         <w:t>The University of Hong Kong</w:t>
@@ -66,6 +70,7 @@
         <w:rPr>
           <w:rFonts w:ascii="Times New Roman" w:hAnsi="Times New Roman"/>
           <w:b w:val="0"/>
+          <w:i w:val="0"/>
           <w:sz w:val="24"/>
         </w:rPr>
         <w:t>Dear Professor Wong,</w:t>
@@ -79,6 +84,7 @@
         <w:rPr>
           <w:rFonts w:ascii="Times New Roman" w:hAnsi="Times New Roman"/>
           <w:b w:val="0"/>
+          <w:i w:val="0"/>
           <w:sz w:val="24"/>
         </w:rPr>
         <w:t>In Gannan this spring I watched a woman measure the road to Lhasa with her body. I had gone to listen. I left hungry rather than full. That is why I later stayed with Wu Zhi Qiao in Gansu, on rural health and infrastructure. Service begins before any drawing is unrolled.</w:t>
@@ -92,6 +98,7 @@
         <w:rPr>
           <w:rFonts w:ascii="Times New Roman" w:hAnsi="Times New Roman"/>
           <w:b w:val="0"/>
+          <w:i w:val="0"/>
           <w:sz w:val="24"/>
         </w:rPr>
         <w:t>I am writing to thank you for selecting me for the Tung and Ngai Foundation Scholarship. Through you I thank the Tung Chao-Yu &amp; Ngai Chue Jai Lily Education Foundation, and the gift of Mr Tung Chao-Yu and Mdm Ngai Chue-Jai Lily. I did not know them. I can say what their support now holds open.</w:t>
@@ -105,9 +112,10 @@
         <w:rPr>
           <w:rFonts w:ascii="Times New Roman" w:hAnsi="Times New Roman"/>
           <w:b w:val="0"/>
+          <w:i w:val="0"/>
           <w:sz w:val="24"/>
         </w:rPr>
-        <w:t>I study Global Health and Development at the University of Hong Kong. I want to work as a translator between epidemiological evidence and the offices that must act on it, and between Hong Kong and Mainland public-health practice. Research is the prerequisite for that service, not the destination. With Professor David Bishai I am studying how heat moves cardiovascular admissions in an ageing, high-density Hong Kong. I want a finding narrow enough for preparedness to stand on: who is harmed, in which season, before the ward fills.</w:t>
+        <w:t>The Scholarship changes the next years in ordinary ways. Tuition and the living allowance let me stay in the work instead of stepping out of it. The exchange subsidy lets the compulsory Mainland programme be a working season rather than a visit — time inside a community and a health system, not a tour of either. After graduation I hope to serve at the Hong Kong–Mainland public-health interface, through a field placement with China CDC and, later, at the Centre for Health Protection. If permitted, I would use the Endeavour Support Fund for a public-health career in the Greater Bay Area — not a start-up for its own sake.</w:t>
       </w:r>
     </w:p>
     <w:p>
@@ -118,22 +126,10 @@
         <w:rPr>
           <w:rFonts w:ascii="Times New Roman" w:hAnsi="Times New Roman"/>
           <w:b w:val="0"/>
+          <w:i w:val="0"/>
           <w:sz w:val="24"/>
         </w:rPr>
-        <w:t>The Scholarship changes the next years in ordinary ways. Tuition and the living allowance keep that work continuous through term. The exchange subsidy lets the compulsory Mainland programme be a working season rather than a visit. I hope to learn how surveillance is gathered and used, toward a field placement with China CDC and, later, work at the Hong Kong–Mainland interface where the Centre for Health Protection’s cross-boundary duties sit. If permitted, I would use the Endeavour Support Fund for a public-health career in the Greater Bay Area — not a start-up for its own sake.</w:t>
-      </w:r>
-    </w:p>
-    <w:p>
-      <w:pPr>
-        <w:spacing w:after="240" w:before="0" w:line="276" w:lineRule="auto"/>
-      </w:pPr>
-      <w:r>
-        <w:rPr>
-          <w:rFonts w:ascii="Times New Roman" w:hAnsi="Times New Roman"/>
-          <w:b w:val="0"/>
-          <w:sz w:val="24"/>
-        </w:rPr>
-        <w:t>The scheme asks scholars to mentor those who follow. I will make time for that. A gift made for people the founders would never meet is repaid in work. I intend to do the work.</w:t>
+        <w:t>The scheme asks scholars to mentor those who follow. I will make time for that, and for more than that. I will keep showing up in Hong Kong — in halls, in classrooms, and in the ordinary community work that does not produce a certificate. I will treat the Mainland exchange as service, not a line on a form. I will help build the scholar community the Foundation expects: sharing what I learn, organising when asked, returning capacity rather than collecting it. A gift made for people the founders would never meet is repaid in work. I intend to do the work.</w:t>
       </w:r>
     </w:p>
     <w:p>
@@ -144,6 +140,7 @@
         <w:rPr>
           <w:rFonts w:ascii="Times New Roman" w:hAnsi="Times New Roman"/>
           <w:b w:val="0"/>
+          <w:i w:val="0"/>
           <w:sz w:val="24"/>
         </w:rPr>
         <w:t>Yours sincerely,</w:t>
@@ -157,6 +154,7 @@
         <w:rPr>
           <w:rFonts w:ascii="Times New Roman" w:hAnsi="Times New Roman"/>
           <w:b w:val="0"/>
+          <w:i w:val="0"/>
           <w:sz w:val="24"/>
         </w:rPr>
         <w:t>SHEN Ruililin</w:t>
@@ -170,6 +168,7 @@
         <w:rPr>
           <w:rFonts w:ascii="Times New Roman" w:hAnsi="Times New Roman"/>
           <w:b w:val="0"/>
+          <w:i w:val="0"/>
           <w:sz w:val="24"/>
         </w:rPr>
         <w:t>The University of Hong Kong</w:t>
@@ -183,6 +182,7 @@
         <w:rPr>
           <w:rFonts w:ascii="Times New Roman" w:hAnsi="Times New Roman"/>
           <w:b w:val="0"/>
+          <w:i w:val="0"/>
           <w:sz w:val="24"/>
         </w:rPr>
         <w:t>University Number: 3036484434</w:t>
@@ -190,12 +190,13 @@
     </w:p>
     <w:p>
       <w:pPr>
-        <w:spacing w:after="160"/>
+        <w:spacing w:after="160" w:before="0" w:line="276" w:lineRule="auto"/>
       </w:pPr>
       <w:r>
         <w:rPr>
           <w:rFonts w:ascii="Times New Roman" w:hAnsi="Times New Roman"/>
           <w:b/>
+          <w:i w:val="0"/>
           <w:sz w:val="24"/>
         </w:rPr>
         <w:t>Photographs</w:t>
@@ -209,6 +210,7 @@
         <w:rPr>
           <w:rFonts w:ascii="Times New Roman" w:hAnsi="Times New Roman"/>
           <w:b w:val="0"/>
+          <w:i w:val="0"/>
           <w:sz w:val="24"/>
         </w:rPr>
         <w:t>Figure 1. Wu Zhi Qiao, Gansu, 2026. Rural health and infrastructure work after Gannan Horizons fieldwork. I am [identify myself in the frame].</w:t>
@@ -222,9 +224,10 @@
         <w:rPr>
           <w:rFonts w:ascii="Times New Roman" w:hAnsi="Times New Roman"/>
           <w:b w:val="0"/>
+          <w:i w:val="0"/>
           <w:sz w:val="24"/>
         </w:rPr>
-        <w:t>Figure 2. Research at HKU, 2025–26. Heat and cardiovascular admissions work with Professor Bishai’s group, or a GHD teaching/lab moment. I am [identify].</w:t>
+        <w:t>Figure 2. Hong Kong service, 2025–26. Peer teaching, hall, or community volunteering. I am [identify].</w:t>
       </w:r>
     </w:p>
     <w:p>
@@ -235,19 +238,24 @@
         <w:rPr>
           <w:rFonts w:ascii="Times New Roman" w:hAnsi="Times New Roman"/>
           <w:b w:val="0"/>
+          <w:i w:val="0"/>
           <w:sz w:val="24"/>
         </w:rPr>
-        <w:t>Figure 3 (optional). A Hong Kong or Mainland public-health service moment — peer teaching or community volunteering. Not a holiday photograph.</w:t>
+        <w:t>Figure 3 (optional). Another Mainland or Hong Kong service moment. Not a holiday photograph.</w:t>
       </w:r>
     </w:p>
     <w:p>
+      <w:pPr>
+        <w:spacing w:after="0" w:before="0" w:line="276" w:lineRule="auto"/>
+      </w:pPr>
       <w:r>
         <w:rPr>
           <w:rFonts w:ascii="Times New Roman" w:hAnsi="Times New Roman"/>
+          <w:b w:val="0"/>
           <w:i/>
           <w:sz w:val="20"/>
         </w:rPr>
-        <w:t>[Drafting note — delete before sending: body word count 325.]</w:t>
+        <w:t>[Drafting note — delete before sending: body word count 318.]</w:t>
       </w:r>
     </w:p>
     <w:sectPr>
@@ -623,9 +631,6 @@
     <w:name w:val="Normal"/>
     <w:qFormat/>
     <w:rsid w:val="00FC693F"/>
-    <w:pPr>
-      <w:spacing w:after="0" w:before="0" w:line="276" w:lineRule="auto"/>
-    </w:pPr>
     <w:rPr>
       <w:rFonts w:ascii="Times New Roman" w:hAnsi="Times New Roman"/>
       <w:sz w:val="24"/>

</xml_diff>

<commit_message>
docs: lead Tung Ngai thank-you with Macha and NEWDAY summer work
Replace the Gannan opening with post-application service: solar lamps
in Macha and a conversation with Steinar Bryn. Add one-line captions.

Co-authored-by: Shen Ruililin <bobshenruililin@users.noreply.github.com>
</commit_message>
<xml_diff>
--- a/docs/writing-voice/outputs/tung-ngai-thank-you-letter-2026.docx
+++ b/docs/writing-voice/outputs/tung-ngai-thank-you-letter-2026.docx
@@ -87,7 +87,21 @@
           <w:i w:val="0"/>
           <w:sz w:val="24"/>
         </w:rPr>
-        <w:t>In Gannan this spring I watched a woman measure the road to Lhasa with her body. I had gone to listen. I left hungry rather than full. That is why I later stayed with Wu Zhi Qiao in Gansu, on rural health and infrastructure. Service begins before any drawing is unrolled.</w:t>
+        <w:t>I applied for this Scholarship before the summer. What I can now show you is the work that followed.</w:t>
+      </w:r>
+    </w:p>
+    <w:p>
+      <w:pPr>
+        <w:spacing w:after="240" w:before="0" w:line="276" w:lineRule="auto"/>
+      </w:pPr>
+      <w:r>
+        <w:rPr>
+          <w:rFonts w:ascii="Times New Roman" w:hAnsi="Times New Roman"/>
+          <w:b w:val="0"/>
+          <w:i w:val="0"/>
+          <w:sz w:val="24"/>
+        </w:rPr>
+        <w:t>With Wu Zhi Qiao in Macha Village, Gansu, I helped plant solar lamps — ordinary infrastructure, done by hand. At the Nansen East-West Dialogue Academy in Lillehammer I sat with Steinar Bryn, whose dialogue work has been nominated several times for the Nobel Peace Prize, and we talked about service to humanity as a practice, not a slogan. The two photographs at the end of this letter are from those rooms.</w:t>
       </w:r>
     </w:p>
     <w:p>
@@ -129,7 +143,7 @@
           <w:i w:val="0"/>
           <w:sz w:val="24"/>
         </w:rPr>
-        <w:t>The scheme asks scholars to mentor those who follow. I will make time for that, and for more than that. I will keep showing up in Hong Kong — in halls, in classrooms, and in the ordinary community work that does not produce a certificate. I will treat the Mainland exchange as service, not a line on a form. I will help build the scholar community the Foundation expects: sharing what I learn, organising when asked, returning capacity rather than collecting it. A gift made for people the founders would never meet is repaid in work. I intend to do the work.</w:t>
+        <w:t>The scheme asks scholars to mentor those who follow. I will make time for that, and for more than that. I will keep showing up in Hong Kong — in halls, in classrooms, and in ordinary community work that does not produce a certificate. I will treat the Mainland exchange as service, not a line on a form. I will help build the scholar community the Foundation expects: sharing what I learn, organising when asked, returning capacity rather than collecting it. A gift made for people the founders would never meet is repaid in work. I intend to do the work.</w:t>
       </w:r>
     </w:p>
     <w:p>
@@ -213,7 +227,7 @@
           <w:i w:val="0"/>
           <w:sz w:val="24"/>
         </w:rPr>
-        <w:t>Figure 1. Wu Zhi Qiao, Gansu, 2026. Rural health and infrastructure work after Gannan Horizons fieldwork. I am [identify myself in the frame].</w:t>
+        <w:t>Figure 1. Macha Village, Gansu, 2026. Planting solar lamps with Wu Zhi Qiao. I am [left / centre / right].</w:t>
       </w:r>
     </w:p>
     <w:p>
@@ -227,21 +241,7 @@
           <w:i w:val="0"/>
           <w:sz w:val="24"/>
         </w:rPr>
-        <w:t>Figure 2. Hong Kong service, 2025–26. Peer teaching, hall, or community volunteering. I am [identify].</w:t>
-      </w:r>
-    </w:p>
-    <w:p>
-      <w:pPr>
-        <w:spacing w:after="160" w:before="0" w:line="276" w:lineRule="auto"/>
-      </w:pPr>
-      <w:r>
-        <w:rPr>
-          <w:rFonts w:ascii="Times New Roman" w:hAnsi="Times New Roman"/>
-          <w:b w:val="0"/>
-          <w:i w:val="0"/>
-          <w:sz w:val="24"/>
-        </w:rPr>
-        <w:t>Figure 3 (optional). Another Mainland or Hong Kong service moment. Not a holiday photograph.</w:t>
+        <w:t>Figure 2. Nansen Academy, Lillehammer, 2026. In conversation with Steinar Bryn. I am [identify].</w:t>
       </w:r>
     </w:p>
     <w:p>
@@ -255,7 +255,7 @@
           <w:i/>
           <w:sz w:val="20"/>
         </w:rPr>
-        <w:t>[Drafting note — delete before sending: body word count 318.]</w:t>
+        <w:t>[Drafting note — delete before sending: body word count 356. Fill the brackets in the captions.]</w:t>
       </w:r>
     </w:p>
     <w:sectPr>
@@ -631,10 +631,6 @@
     <w:name w:val="Normal"/>
     <w:qFormat/>
     <w:rsid w:val="00FC693F"/>
-    <w:rPr>
-      <w:rFonts w:ascii="Times New Roman" w:hAnsi="Times New Roman"/>
-      <w:sz w:val="24"/>
-    </w:rPr>
   </w:style>
   <w:style w:type="paragraph" w:styleId="Header">
     <w:name w:val="header"/>

</xml_diff>

<commit_message>
docs: strip flowers from Tung Ngai thank-you
Thank first. WZQ is a two-week Macha stay, not a lamp project.
Cut family-need and health-system claims. Shorten the close.

Co-authored-by: Shen Ruililin <bobshenruililin@users.noreply.github.com>
</commit_message>
<xml_diff>
--- a/docs/writing-voice/outputs/tung-ngai-thank-you-letter-2026.docx
+++ b/docs/writing-voice/outputs/tung-ngai-thank-you-letter-2026.docx
@@ -87,7 +87,7 @@
           <w:i w:val="0"/>
           <w:sz w:val="24"/>
         </w:rPr>
-        <w:t>I applied for this Scholarship before the summer. What I can now show you is the work that followed.</w:t>
+        <w:t>Thank you for selecting me for the Tung and Ngai Foundation Scholarship. Through you I thank the Tung Chao-Yu &amp; Ngai Chue Jai Lily Education Foundation, and the founders, Mr Tung Chao-Yu and Mdm Ngai Chue-Jai Lily.</w:t>
       </w:r>
     </w:p>
     <w:p>
@@ -101,7 +101,7 @@
           <w:i w:val="0"/>
           <w:sz w:val="24"/>
         </w:rPr>
-        <w:t>With Wu Zhi Qiao in Macha Village, Gansu, I helped plant solar lamps — ordinary infrastructure, done by hand. At the Nansen East-West Dialogue Academy in Lillehammer I sat with Steinar Bryn, whose dialogue work has been nominated several times for the Nobel Peace Prize, and we talked about service to humanity as a practice, not a slogan. The two photographs at the end of this letter are from those rooms.</w:t>
+        <w:t>This is a career and service award. It asks me to return capacity to Hong Kong and to China. That is the standard I want to be held to. The tuition and living allowance let me stay in my studies and in that work. The exchange subsidy means the compulsory Mainland programme can be a working stay, not a short visit. If permitted, I would use the Endeavour Support Fund for a public-health career in the Greater Bay Area, not a start-up.</w:t>
       </w:r>
     </w:p>
     <w:p>
@@ -115,7 +115,7 @@
           <w:i w:val="0"/>
           <w:sz w:val="24"/>
         </w:rPr>
-        <w:t>I am writing to thank you for selecting me for the Tung and Ngai Foundation Scholarship. Through you I thank the Tung Chao-Yu &amp; Ngai Chue Jai Lily Education Foundation, and the gift of Mr Tung Chao-Yu and Mdm Ngai Chue-Jai Lily. I did not know them. I can say what their support now holds open.</w:t>
+        <w:t>I want to work at the Hong Kong–Mainland public-health interface: a field placement with China CDC during my degree, and later the Centre for Health Protection.</w:t>
       </w:r>
     </w:p>
     <w:p>
@@ -129,7 +129,7 @@
           <w:i w:val="0"/>
           <w:sz w:val="24"/>
         </w:rPr>
-        <w:t>The Scholarship changes the next years in ordinary ways. Tuition and the living allowance let me stay in the work instead of stepping out of it. The exchange subsidy lets the compulsory Mainland programme be a working season rather than a visit — time inside a community and a health system, not a tour of either. After graduation I hope to serve at the Hong Kong–Mainland public-health interface, through a field placement with China CDC and, later, at the Centre for Health Protection. If permitted, I would use the Endeavour Support Fund for a public-health career in the Greater Bay Area — not a start-up for its own sake.</w:t>
+        <w:t>This summer I spent two weeks in Macha Village, Gansu, on an HKU Horizons and Wu Zhi Qiao service-learning programme, as a student coordinator, after a visit in Shaanxi. We lived in the village. In groups we studied how water is managed on dry loess land, how rammed-earth houses are built, and how families live and eat. We also did the physical work of rural infrastructure. One of those jobs was installing solar street lamps. That is the photograph; it is not the whole stay. My job was to help the team be useful — logistics, listening, and not getting ahead of the village. At the Nansen East-West Dialogue Academy in Lillehammer I spoke with Steinar Bryn about what it means to serve other people.</w:t>
       </w:r>
     </w:p>
     <w:p>
@@ -143,7 +143,7 @@
           <w:i w:val="0"/>
           <w:sz w:val="24"/>
         </w:rPr>
-        <w:t>The scheme asks scholars to mentor those who follow. I will make time for that, and for more than that. I will keep showing up in Hong Kong — in halls, in classrooms, and in ordinary community work that does not produce a certificate. I will treat the Mainland exchange as service, not a line on a form. I will help build the scholar community the Foundation expects: sharing what I learn, organising when asked, returning capacity rather than collecting it. A gift made for people the founders would never meet is repaid in work. I intend to do the work.</w:t>
+        <w:t>The scheme asks scholars to mentor those who follow. I will. I will also keep serving in Hong Kong, and treat time on the Mainland as service. A gift made for people the founders would never meet is repaid in work. I intend to do the work.</w:t>
       </w:r>
     </w:p>
     <w:p>
@@ -227,7 +227,7 @@
           <w:i w:val="0"/>
           <w:sz w:val="24"/>
         </w:rPr>
-        <w:t>Figure 1. Macha Village, Gansu, 2026. Planting solar lamps with Wu Zhi Qiao. I am [left / centre / right].</w:t>
+        <w:t>Figure 1. Macha Village, Gansu, June 2026. Installing solar street lamps — one task in a two-week Wu Zhi Qiao stay. I am [left / centre / right].</w:t>
       </w:r>
     </w:p>
     <w:p>
@@ -241,7 +241,7 @@
           <w:i w:val="0"/>
           <w:sz w:val="24"/>
         </w:rPr>
-        <w:t>Figure 2. Nansen Academy, Lillehammer, 2026. In conversation with Steinar Bryn. I am [identify].</w:t>
+        <w:t>Figure 2. Nansen Academy, Lillehammer, 2026. Talking with Steinar Bryn. I am [identify].</w:t>
       </w:r>
     </w:p>
     <w:p>
@@ -255,7 +255,7 @@
           <w:i/>
           <w:sz w:val="20"/>
         </w:rPr>
-        <w:t>[Drafting note — delete before sending: body word count 356. Fill the brackets in the captions.]</w:t>
+        <w:t>[Delete before sending. Body word count 317. Fill the caption brackets.]</w:t>
       </w:r>
     </w:p>
     <w:sectPr>

</xml_diff>

<commit_message>
docs: merge Tung Ngai thank-you aims with all four award parts
Drop the lecture on what the scheme is. Name tuition, living,
exchange, and Endeavour. Keep public-health work and entrepreneurship.

Co-authored-by: Shen Ruililin <bobshenruililin@users.noreply.github.com>
</commit_message>
<xml_diff>
--- a/docs/writing-voice/outputs/tung-ngai-thank-you-letter-2026.docx
+++ b/docs/writing-voice/outputs/tung-ngai-thank-you-letter-2026.docx
@@ -4,12 +4,12 @@
   <w:body>
     <w:p>
       <w:pPr>
-        <w:spacing w:after="0" w:before="0" w:line="276" w:lineRule="auto"/>
+        <w:spacing w:before="0" w:after="0" w:line="276" w:lineRule="auto"/>
         <w:jc w:val="center"/>
       </w:pPr>
       <w:r>
         <w:rPr>
-          <w:rFonts w:ascii="Times New Roman" w:hAnsi="Times New Roman"/>
+          <w:rFonts w:ascii="Times New Roman" w:hAnsi="Times New Roman" w:eastAsia="Times New Roman"/>
           <w:b w:val="0"/>
           <w:i w:val="0"/>
           <w:sz w:val="24"/>
@@ -19,12 +19,12 @@
     </w:p>
     <w:p>
       <w:pPr>
-        <w:spacing w:after="0" w:before="0" w:line="276" w:lineRule="auto"/>
+        <w:spacing w:before="0" w:after="0" w:line="276" w:lineRule="auto"/>
         <w:jc w:val="center"/>
       </w:pPr>
       <w:r>
         <w:rPr>
-          <w:rFonts w:ascii="Times New Roman" w:hAnsi="Times New Roman"/>
+          <w:rFonts w:ascii="Times New Roman" w:hAnsi="Times New Roman" w:eastAsia="Times New Roman"/>
           <w:b w:val="0"/>
           <w:i w:val="0"/>
           <w:sz w:val="24"/>
@@ -34,12 +34,12 @@
     </w:p>
     <w:p>
       <w:pPr>
-        <w:spacing w:after="0" w:before="0" w:line="276" w:lineRule="auto"/>
+        <w:spacing w:before="0" w:after="0" w:line="276" w:lineRule="auto"/>
         <w:jc w:val="center"/>
       </w:pPr>
       <w:r>
         <w:rPr>
-          <w:rFonts w:ascii="Times New Roman" w:hAnsi="Times New Roman"/>
+          <w:rFonts w:ascii="Times New Roman" w:hAnsi="Times New Roman" w:eastAsia="Times New Roman"/>
           <w:b w:val="0"/>
           <w:i w:val="0"/>
           <w:sz w:val="24"/>
@@ -49,12 +49,12 @@
     </w:p>
     <w:p>
       <w:pPr>
-        <w:spacing w:after="360" w:before="0" w:line="276" w:lineRule="auto"/>
+        <w:spacing w:before="0" w:after="180" w:line="276" w:lineRule="auto"/>
         <w:jc w:val="center"/>
       </w:pPr>
       <w:r>
         <w:rPr>
-          <w:rFonts w:ascii="Times New Roman" w:hAnsi="Times New Roman"/>
+          <w:rFonts w:ascii="Times New Roman" w:hAnsi="Times New Roman" w:eastAsia="Times New Roman"/>
           <w:b w:val="0"/>
           <w:i w:val="0"/>
           <w:sz w:val="24"/>
@@ -64,11 +64,11 @@
     </w:p>
     <w:p>
       <w:pPr>
-        <w:spacing w:after="240" w:before="0" w:line="276" w:lineRule="auto"/>
+        <w:spacing w:before="0" w:after="120" w:line="276" w:lineRule="auto"/>
       </w:pPr>
       <w:r>
         <w:rPr>
-          <w:rFonts w:ascii="Times New Roman" w:hAnsi="Times New Roman"/>
+          <w:rFonts w:ascii="Times New Roman" w:hAnsi="Times New Roman" w:eastAsia="Times New Roman"/>
           <w:b w:val="0"/>
           <w:i w:val="0"/>
           <w:sz w:val="24"/>
@@ -78,11 +78,11 @@
     </w:p>
     <w:p>
       <w:pPr>
-        <w:spacing w:after="240" w:before="0" w:line="276" w:lineRule="auto"/>
+        <w:spacing w:before="0" w:after="120" w:line="276" w:lineRule="auto"/>
       </w:pPr>
       <w:r>
         <w:rPr>
-          <w:rFonts w:ascii="Times New Roman" w:hAnsi="Times New Roman"/>
+          <w:rFonts w:ascii="Times New Roman" w:hAnsi="Times New Roman" w:eastAsia="Times New Roman"/>
           <w:b w:val="0"/>
           <w:i w:val="0"/>
           <w:sz w:val="24"/>
@@ -92,39 +92,25 @@
     </w:p>
     <w:p>
       <w:pPr>
-        <w:spacing w:after="240" w:before="0" w:line="276" w:lineRule="auto"/>
+        <w:spacing w:before="0" w:after="120" w:line="276" w:lineRule="auto"/>
       </w:pPr>
       <w:r>
         <w:rPr>
-          <w:rFonts w:ascii="Times New Roman" w:hAnsi="Times New Roman"/>
+          <w:rFonts w:ascii="Times New Roman" w:hAnsi="Times New Roman" w:eastAsia="Times New Roman"/>
           <w:b w:val="0"/>
           <w:i w:val="0"/>
           <w:sz w:val="24"/>
         </w:rPr>
-        <w:t>This is a career and service award. It asks me to return capacity to Hong Kong and to China. That is the standard I want to be held to. The tuition and living allowance let me stay in my studies and in that work. The exchange subsidy means the compulsory Mainland programme can be a working stay, not a short visit. If permitted, I would use the Endeavour Support Fund for a public-health career in the Greater Bay Area, not a start-up.</w:t>
+        <w:t>I want to work at the Hong Kong–Mainland public-health interface: a field placement with China CDC during my degree, and later the Centre for Health Protection. I am interested in entrepreneurship as well. The tuition and living allowance let me stay in my studies and in that work. The exchange subsidy means the compulsory Mainland programme can be a working stay. The Endeavour Support Fund is for a career or a start-up in the Greater Bay Area or on the Mainland. I would use it for the public-health path, and for a start-up if I have one worth building.</w:t>
       </w:r>
     </w:p>
     <w:p>
       <w:pPr>
-        <w:spacing w:after="240" w:before="0" w:line="276" w:lineRule="auto"/>
+        <w:spacing w:before="0" w:after="120" w:line="276" w:lineRule="auto"/>
       </w:pPr>
       <w:r>
         <w:rPr>
-          <w:rFonts w:ascii="Times New Roman" w:hAnsi="Times New Roman"/>
-          <w:b w:val="0"/>
-          <w:i w:val="0"/>
-          <w:sz w:val="24"/>
-        </w:rPr>
-        <w:t>I want to work at the Hong Kong–Mainland public-health interface: a field placement with China CDC during my degree, and later the Centre for Health Protection.</w:t>
-      </w:r>
-    </w:p>
-    <w:p>
-      <w:pPr>
-        <w:spacing w:after="240" w:before="0" w:line="276" w:lineRule="auto"/>
-      </w:pPr>
-      <w:r>
-        <w:rPr>
-          <w:rFonts w:ascii="Times New Roman" w:hAnsi="Times New Roman"/>
+          <w:rFonts w:ascii="Times New Roman" w:hAnsi="Times New Roman" w:eastAsia="Times New Roman"/>
           <w:b w:val="0"/>
           <w:i w:val="0"/>
           <w:sz w:val="24"/>
@@ -134,11 +120,11 @@
     </w:p>
     <w:p>
       <w:pPr>
-        <w:spacing w:after="240" w:before="0" w:line="276" w:lineRule="auto"/>
+        <w:spacing w:before="0" w:after="120" w:line="276" w:lineRule="auto"/>
       </w:pPr>
       <w:r>
         <w:rPr>
-          <w:rFonts w:ascii="Times New Roman" w:hAnsi="Times New Roman"/>
+          <w:rFonts w:ascii="Times New Roman" w:hAnsi="Times New Roman" w:eastAsia="Times New Roman"/>
           <w:b w:val="0"/>
           <w:i w:val="0"/>
           <w:sz w:val="24"/>
@@ -148,11 +134,11 @@
     </w:p>
     <w:p>
       <w:pPr>
-        <w:spacing w:after="480" w:before="0" w:line="276" w:lineRule="auto"/>
+        <w:spacing w:before="0" w:after="240" w:line="276" w:lineRule="auto"/>
       </w:pPr>
       <w:r>
         <w:rPr>
-          <w:rFonts w:ascii="Times New Roman" w:hAnsi="Times New Roman"/>
+          <w:rFonts w:ascii="Times New Roman" w:hAnsi="Times New Roman" w:eastAsia="Times New Roman"/>
           <w:b w:val="0"/>
           <w:i w:val="0"/>
           <w:sz w:val="24"/>
@@ -162,11 +148,11 @@
     </w:p>
     <w:p>
       <w:pPr>
-        <w:spacing w:after="0" w:before="0" w:line="276" w:lineRule="auto"/>
+        <w:spacing w:before="0" w:after="0" w:line="276" w:lineRule="auto"/>
       </w:pPr>
       <w:r>
         <w:rPr>
-          <w:rFonts w:ascii="Times New Roman" w:hAnsi="Times New Roman"/>
+          <w:rFonts w:ascii="Times New Roman" w:hAnsi="Times New Roman" w:eastAsia="Times New Roman"/>
           <w:b w:val="0"/>
           <w:i w:val="0"/>
           <w:sz w:val="24"/>
@@ -176,11 +162,11 @@
     </w:p>
     <w:p>
       <w:pPr>
-        <w:spacing w:after="0" w:before="0" w:line="276" w:lineRule="auto"/>
+        <w:spacing w:before="0" w:after="0" w:line="276" w:lineRule="auto"/>
       </w:pPr>
       <w:r>
         <w:rPr>
-          <w:rFonts w:ascii="Times New Roman" w:hAnsi="Times New Roman"/>
+          <w:rFonts w:ascii="Times New Roman" w:hAnsi="Times New Roman" w:eastAsia="Times New Roman"/>
           <w:b w:val="0"/>
           <w:i w:val="0"/>
           <w:sz w:val="24"/>
@@ -190,11 +176,11 @@
     </w:p>
     <w:p>
       <w:pPr>
-        <w:spacing w:after="360" w:before="0" w:line="276" w:lineRule="auto"/>
+        <w:spacing w:before="0" w:after="180" w:line="276" w:lineRule="auto"/>
       </w:pPr>
       <w:r>
         <w:rPr>
-          <w:rFonts w:ascii="Times New Roman" w:hAnsi="Times New Roman"/>
+          <w:rFonts w:ascii="Times New Roman" w:hAnsi="Times New Roman" w:eastAsia="Times New Roman"/>
           <w:b w:val="0"/>
           <w:i w:val="0"/>
           <w:sz w:val="24"/>
@@ -204,11 +190,11 @@
     </w:p>
     <w:p>
       <w:pPr>
-        <w:spacing w:after="160" w:before="0" w:line="276" w:lineRule="auto"/>
+        <w:spacing w:before="0" w:after="80" w:line="276" w:lineRule="auto"/>
       </w:pPr>
       <w:r>
         <w:rPr>
-          <w:rFonts w:ascii="Times New Roman" w:hAnsi="Times New Roman"/>
+          <w:rFonts w:ascii="Times New Roman" w:hAnsi="Times New Roman" w:eastAsia="Times New Roman"/>
           <w:b/>
           <w:i w:val="0"/>
           <w:sz w:val="24"/>
@@ -218,11 +204,11 @@
     </w:p>
     <w:p>
       <w:pPr>
-        <w:spacing w:after="160" w:before="0" w:line="276" w:lineRule="auto"/>
+        <w:spacing w:before="0" w:after="80" w:line="276" w:lineRule="auto"/>
       </w:pPr>
       <w:r>
         <w:rPr>
-          <w:rFonts w:ascii="Times New Roman" w:hAnsi="Times New Roman"/>
+          <w:rFonts w:ascii="Times New Roman" w:hAnsi="Times New Roman" w:eastAsia="Times New Roman"/>
           <w:b w:val="0"/>
           <w:i w:val="0"/>
           <w:sz w:val="24"/>
@@ -232,11 +218,11 @@
     </w:p>
     <w:p>
       <w:pPr>
-        <w:spacing w:after="160" w:before="0" w:line="276" w:lineRule="auto"/>
+        <w:spacing w:before="0" w:after="80" w:line="276" w:lineRule="auto"/>
       </w:pPr>
       <w:r>
         <w:rPr>
-          <w:rFonts w:ascii="Times New Roman" w:hAnsi="Times New Roman"/>
+          <w:rFonts w:ascii="Times New Roman" w:hAnsi="Times New Roman" w:eastAsia="Times New Roman"/>
           <w:b w:val="0"/>
           <w:i w:val="0"/>
           <w:sz w:val="24"/>
@@ -246,16 +232,16 @@
     </w:p>
     <w:p>
       <w:pPr>
-        <w:spacing w:after="0" w:before="0" w:line="276" w:lineRule="auto"/>
+        <w:spacing w:before="0" w:after="0" w:line="276" w:lineRule="auto"/>
       </w:pPr>
       <w:r>
         <w:rPr>
-          <w:rFonts w:ascii="Times New Roman" w:hAnsi="Times New Roman"/>
+          <w:rFonts w:ascii="Times New Roman" w:hAnsi="Times New Roman" w:eastAsia="Times New Roman"/>
           <w:b w:val="0"/>
           <w:i/>
           <w:sz w:val="20"/>
         </w:rPr>
-        <w:t>[Delete before sending. Body word count 317. Fill the caption brackets.]</w:t>
+        <w:t>[Delete before sending. Body word count 308. Fill the caption brackets.]</w:t>
       </w:r>
     </w:p>
     <w:sectPr>

</xml_diff>

<commit_message>
docs: one-shot Tung Ngai thank-you from Bob's comments
Kill working-stay and the photo aside. Restore the summer hinge.
Treat Macha and Lillehammer as slices. Name dialogue, not a pose.

Co-authored-by: Shen Ruililin <bobshenruililin@users.noreply.github.com>
</commit_message>
<xml_diff>
--- a/docs/writing-voice/outputs/tung-ngai-thank-you-letter-2026.docx
+++ b/docs/writing-voice/outputs/tung-ngai-thank-you-letter-2026.docx
@@ -101,7 +101,7 @@
           <w:i w:val="0"/>
           <w:sz w:val="24"/>
         </w:rPr>
-        <w:t>I want to work at the Hong Kong–Mainland public-health interface: a field placement with China CDC during my degree, and later the Centre for Health Protection. I am interested in entrepreneurship as well. The tuition and living allowance let me stay in my studies and in that work. The exchange subsidy means the compulsory Mainland programme can be a working stay. The Endeavour Support Fund is for a career or a start-up in the Greater Bay Area or on the Mainland. I would use it for the public-health path, and for a start-up if I have one worth building.</w:t>
+        <w:t>I want to work at the Hong Kong–Mainland public-health interface: a field placement with China CDC during my degree, and later the Centre for Health Protection. I am interested in entrepreneurship as well. The tuition and living allowance let me stay in my studies and in that work. The exchange subsidy lets me take the compulsory Mainland programme as time to learn there, and to understand the place better. The Endeavour Support Fund is for a career or a start-up in the Greater Bay Area or on the Mainland. I would use it for the public-health path, and for a start-up if I have one worth building.</w:t>
       </w:r>
     </w:p>
     <w:p>
@@ -115,7 +115,7 @@
           <w:i w:val="0"/>
           <w:sz w:val="24"/>
         </w:rPr>
-        <w:t>This summer I spent two weeks in Macha Village, Gansu, on an HKU Horizons and Wu Zhi Qiao service-learning programme, as a student coordinator, after a visit in Shaanxi. We lived in the village. In groups we studied how water is managed on dry loess land, how rammed-earth houses are built, and how families live and eat. We also did the physical work of rural infrastructure. One of those jobs was installing solar street lamps. That is the photograph; it is not the whole stay. My job was to help the team be useful — logistics, listening, and not getting ahead of the village. At the Nansen East-West Dialogue Academy in Lillehammer I spoke with Steinar Bryn about what it means to serve other people.</w:t>
+        <w:t>I applied for this Scholarship before the summer. What I can now show you is the work this summer. I spent two weeks in Macha Village, Gansu, on an HKU Horizons and Wu Zhi Qiao service-learning programme, as a student coordinator, after a visit in Shaanxi. We lived in the village. In groups we studied how water is managed on dry loess land, how rammed-earth houses are built, and how families live and eat. We also did the physical work of rural infrastructure. One of those jobs was installing solar street lamps. My job was to help the team be useful — logistics, listening, and not getting ahead of the village. At the Nansen East-West Dialogue Academy in Lillehammer the work was mostly conversation: people trying to understand one another, and to support one another. I spoke with Steinar Bryn about what it means to serve other people. Macha and Lillehammer are slices of the work, not the work itself.</w:t>
       </w:r>
     </w:p>
     <w:p>
@@ -213,7 +213,7 @@
           <w:i w:val="0"/>
           <w:sz w:val="24"/>
         </w:rPr>
-        <w:t>Figure 1. Macha Village, Gansu, June 2026. Installing solar street lamps — one task in a two-week Wu Zhi Qiao stay. I am [left / centre / right].</w:t>
+        <w:t>Figure 1. Macha Village, Gansu, June 2026. Installing solar street lamps as part of Wu Zhi Qiao.</w:t>
       </w:r>
     </w:p>
     <w:p>
@@ -227,7 +227,7 @@
           <w:i w:val="0"/>
           <w:sz w:val="24"/>
         </w:rPr>
-        <w:t>Figure 2. Nansen Academy, Lillehammer, 2026. Talking with Steinar Bryn. I am [identify].</w:t>
+        <w:t>Figure 2. Nansen Academy, Lillehammer, Norway, August 2026. Talking with Steinar Bryn.</w:t>
       </w:r>
     </w:p>
     <w:p>
@@ -241,7 +241,7 @@
           <w:i/>
           <w:sz w:val="20"/>
         </w:rPr>
-        <w:t>[Delete before sending. Body word count 308. Fill the caption brackets.]</w:t>
+        <w:t>[Delete before sending. Body word count 351. If a photograph is a group shot, say which person you are.]</w:t>
       </w:r>
     </w:p>
     <w:sectPr>

</xml_diff>

<commit_message>
docs: lock Tung Ngai thank-you — Bob's summer paragraph
Drop are/not and the Mainland-as-service gloss. Keep NEWDAY as
East-West conversation. Close is mentor, then serve HK and Mainland.

Co-authored-by: Shen Ruililin <bobshenruililin@users.noreply.github.com>
</commit_message>
<xml_diff>
--- a/docs/writing-voice/outputs/tung-ngai-thank-you-letter-2026.docx
+++ b/docs/writing-voice/outputs/tung-ngai-thank-you-letter-2026.docx
@@ -115,7 +115,7 @@
           <w:i w:val="0"/>
           <w:sz w:val="24"/>
         </w:rPr>
-        <w:t>I applied for this Scholarship before the summer. What I can now show you is the work this summer. I spent two weeks in Macha Village, Gansu, on an HKU Horizons and Wu Zhi Qiao service-learning programme, as a student coordinator, after a visit in Shaanxi. We lived in the village. In groups we studied how water is managed on dry loess land, how rammed-earth houses are built, and how families live and eat. We also did the physical work of rural infrastructure. One of those jobs was installing solar street lamps. My job was to help the team be useful — logistics, listening, and not getting ahead of the village. At the Nansen East-West Dialogue Academy in Lillehammer the work was mostly conversation: people trying to understand one another, and to support one another. I spoke with Steinar Bryn about what it means to serve other people. Macha and Lillehammer are slices of the work, not the work itself.</w:t>
+        <w:t>I applied for this scholarship before the summer. What I can now show you is the work this summer. I spent two weeks in Macha Village, Gansu, on an HKU Horizons and Wu Zhi Qiao service-learning programme, as a student coordinator, after a visit in Shaanxi. We lived in the village. In groups we studied how water is managed on dry loess land, how rammed-earth houses are built, and how families live and eat. We also did the physical work of rural infrastructure. One of those jobs was installing solar street lamps. My job was to help the team be useful—logistics, listening, and understanding the local context of the village. At the Nansen East-West Dialogue Academy in Lillehammer the work was mostly conversation: young people from the west and the east trying to understand one another, and to support one another. I spoke with Steinar Bryn about what it means to serve other people.</w:t>
       </w:r>
     </w:p>
     <w:p>
@@ -129,7 +129,7 @@
           <w:i w:val="0"/>
           <w:sz w:val="24"/>
         </w:rPr>
-        <w:t>The scheme asks scholars to mentor those who follow. I will. I will also keep serving in Hong Kong, and treat time on the Mainland as service. A gift made for people the founders would never meet is repaid in work. I intend to do the work.</w:t>
+        <w:t>The scheme asks scholars to mentor those who follow. I will. I will also keep serving in Hong Kong and the Mainland. A gift made for people the founders would never meet is repaid in work. I intend to do the work.</w:t>
       </w:r>
     </w:p>
     <w:p>
@@ -241,7 +241,7 @@
           <w:i/>
           <w:sz w:val="20"/>
         </w:rPr>
-        <w:t>[Delete before sending. Body word count 351. If a photograph is a group shot, say which person you are.]</w:t>
+        <w:t>[Delete before sending. Body word count 340. If a photograph is a group shot, say which person you are.]</w:t>
       </w:r>
     </w:p>
     <w:sectPr>

</xml_diff>

<commit_message>
docs: treat Endeavour as start-up capital; NEWDAY as understanding
Drop public-health path and the if-I-have-one hedge. Name
understanding as the work of cooperation and of public health.

Co-authored-by: Shen Ruililin <bobshenruililin@users.noreply.github.com>
</commit_message>
<xml_diff>
--- a/docs/writing-voice/outputs/tung-ngai-thank-you-letter-2026.docx
+++ b/docs/writing-voice/outputs/tung-ngai-thank-you-letter-2026.docx
@@ -101,7 +101,7 @@
           <w:i w:val="0"/>
           <w:sz w:val="24"/>
         </w:rPr>
-        <w:t>I want to work at the Hong Kong–Mainland public-health interface: a field placement with China CDC during my degree, and later the Centre for Health Protection. I am interested in entrepreneurship as well. The tuition and living allowance let me stay in my studies and in that work. The exchange subsidy lets me take the compulsory Mainland programme as time to learn there, and to understand the place better. The Endeavour Support Fund is for a career or a start-up in the Greater Bay Area or on the Mainland. I would use it for the public-health path, and for a start-up if I have one worth building.</w:t>
+        <w:t>I want to work at the Hong Kong–Mainland public-health interface: a field placement with China CDC during my degree, and later the Centre for Health Protection. The tuition and living allowance let me stay in my studies and in that work. The exchange subsidy lets me take the compulsory Mainland programme as time to learn there, and to understand the place better. The Endeavour Support Fund is start-up capital for the Greater Bay Area or the Mainland. I will use it to build in public health.</w:t>
       </w:r>
     </w:p>
     <w:p>
@@ -115,7 +115,7 @@
           <w:i w:val="0"/>
           <w:sz w:val="24"/>
         </w:rPr>
-        <w:t>I applied for this scholarship before the summer. What I can now show you is the work this summer. I spent two weeks in Macha Village, Gansu, on an HKU Horizons and Wu Zhi Qiao service-learning programme, as a student coordinator, after a visit in Shaanxi. We lived in the village. In groups we studied how water is managed on dry loess land, how rammed-earth houses are built, and how families live and eat. We also did the physical work of rural infrastructure. One of those jobs was installing solar street lamps. My job was to help the team be useful—logistics, listening, and understanding the local context of the village. At the Nansen East-West Dialogue Academy in Lillehammer the work was mostly conversation: young people from the west and the east trying to understand one another, and to support one another. I spoke with Steinar Bryn about what it means to serve other people.</w:t>
+        <w:t>I applied for this scholarship before the summer. What I can now show you is the work this summer. I spent two weeks in Macha Village, Gansu, on an HKU Horizons and Wu Zhi Qiao service-learning programme, as a student coordinator, after a visit in Shaanxi. We lived in the village. In groups we studied how water is managed on dry loess land, how rammed-earth houses are built, and how families live and eat. We also did the physical work of rural infrastructure. One of those jobs was installing solar street lamps. My job was to help the team be useful—logistics, listening, and understanding the local context of the village. At the Nansen East-West Dialogue Academy in Lillehammer, young people from the west and the east worked at understanding one another, and at supporting one another. Understanding is the backbone of cooperation, and the nature of public health. I spoke with Steinar Bryn about what it means to serve other people.</w:t>
       </w:r>
     </w:p>
     <w:p>
@@ -241,7 +241,7 @@
           <w:i/>
           <w:sz w:val="20"/>
         </w:rPr>
-        <w:t>[Delete before sending. Body word count 340. If a photograph is a group shot, say which person you are.]</w:t>
+        <w:t>[Delete before sending. Body word count 326. If a photograph is a group shot, say which person you are.]</w:t>
       </w:r>
     </w:p>
     <w:sectPr>

</xml_diff>

<commit_message>
docs: drop Bryn name-drop from Tung Ngai thank-you body
The caption already shows the conversation. The paragraph stays
on understanding as the work of public health across systems.

Co-authored-by: Shen Ruililin <bobshenruililin@users.noreply.github.com>
</commit_message>
<xml_diff>
--- a/docs/writing-voice/outputs/tung-ngai-thank-you-letter-2026.docx
+++ b/docs/writing-voice/outputs/tung-ngai-thank-you-letter-2026.docx
@@ -115,7 +115,7 @@
           <w:i w:val="0"/>
           <w:sz w:val="24"/>
         </w:rPr>
-        <w:t>I applied for this scholarship before the summer. What I can now show you is the work this summer. I spent two weeks in Macha Village, Gansu, on an HKU Horizons and Wu Zhi Qiao service-learning programme, as a student coordinator, after a visit in Shaanxi. We lived in the village. In groups we studied how water is managed on dry loess land, how rammed-earth houses are built, and how families live and eat. We also did the physical work of rural infrastructure. One of those jobs was installing solar street lamps. My job was to help the team be useful—logistics, listening, and understanding the local context of the village. At the Nansen East-West Dialogue Academy in Lillehammer, young people from the west and the east worked at understanding one another, and at supporting one another. Understanding is the backbone of cooperation, and the nature of public health. I spoke with Steinar Bryn about what it means to serve other people.</w:t>
+        <w:t>I applied for this scholarship before the summer. What I can now show you is the work this summer. I spent two weeks in Macha Village, Gansu, on an HKU Horizons and Wu Zhi Qiao service-learning programme, as a student coordinator, after a visit in Shaanxi. We lived in the village. In groups we studied how water is managed on dry loess land, how rammed-earth houses are built, and how families live and eat. We also did the physical work of rural infrastructure. One of those jobs was installing solar street lamps. My job was to help the team be useful—logistics, listening, and understanding the local context of the village. At the Nansen East-West Dialogue Academy in Lillehammer I was among students from east and west whose task was to understand each other well enough to help each other. That is the task of public health when two systems have to act together.</w:t>
       </w:r>
     </w:p>
     <w:p>
@@ -241,7 +241,7 @@
           <w:i/>
           <w:sz w:val="20"/>
         </w:rPr>
-        <w:t>[Delete before sending. Body word count 326. If a photograph is a group shot, say which person you are.]</w:t>
+        <w:t>[Delete before sending. Body word count 318. If a photograph is a group shot, say which person you are.]</w:t>
       </w:r>
     </w:p>
     <w:sectPr>

</xml_diff>

<commit_message>
docs: final Tung Ngai thank-you with NEWDAY captions
Keep the Gannan opening and both photos. Caption Macha and
Steinar Bryn’s home. No prize line. Body 302 words.

Co-authored-by: Shen Ruililin <bobshenruililin@users.noreply.github.com>
</commit_message>
<xml_diff>
--- a/docs/writing-voice/outputs/tung-ngai-thank-you-letter-2026.docx
+++ b/docs/writing-voice/outputs/tung-ngai-thank-you-letter-2026.docx
@@ -4,12 +4,95 @@
   <w:body>
     <w:p>
       <w:pPr>
-        <w:spacing w:before="0" w:after="0" w:line="276" w:lineRule="auto"/>
-        <w:jc w:val="center"/>
+        <w:spacing w:after="240" w:before="0" w:line="276" w:lineRule="auto"/>
       </w:pPr>
       <w:r>
         <w:rPr>
-          <w:rFonts w:ascii="Times New Roman" w:hAnsi="Times New Roman" w:eastAsia="Times New Roman"/>
+          <w:rFonts w:ascii="Times New Roman" w:hAnsi="Times New Roman"/>
+          <w:b w:val="0"/>
+          <w:i w:val="0"/>
+          <w:sz w:val="24"/>
+        </w:rPr>
+        <w:t>Dear Professor Wong,</w:t>
+      </w:r>
+    </w:p>
+    <w:p>
+      <w:pPr>
+        <w:spacing w:after="240" w:before="0" w:line="276" w:lineRule="auto"/>
+      </w:pPr>
+      <w:r>
+        <w:rPr>
+          <w:rFonts w:ascii="Times New Roman" w:hAnsi="Times New Roman"/>
+          <w:b w:val="0"/>
+          <w:i w:val="0"/>
+          <w:sz w:val="24"/>
+        </w:rPr>
+        <w:t>In Gannan this spring I watched a woman measure the road to Lhasa with her body. I had gone to listen. I left hungry rather than full. That is why, in June, I lived in Macha Village, Gansu, as student coordinator on Wu Zhi Qiao: solar street lamps, and how water, rammed earth and family life hold a village together. In August, at the Nansen East-West Dialogue Academy in Lillehammer, Steinar Bryn invited us into his home. Around his table the work was the same: listen until the other side is real.</w:t>
+      </w:r>
+    </w:p>
+    <w:p>
+      <w:pPr>
+        <w:spacing w:after="240" w:before="0" w:line="276" w:lineRule="auto"/>
+      </w:pPr>
+      <w:r>
+        <w:rPr>
+          <w:rFonts w:ascii="Times New Roman" w:hAnsi="Times New Roman"/>
+          <w:b w:val="0"/>
+          <w:i w:val="0"/>
+          <w:sz w:val="24"/>
+        </w:rPr>
+        <w:t>I am writing to thank you for selecting me for the Tung and Ngai Foundation Scholarship, and, through you, to thank the Tung Chao-Yu &amp; Ngai Chue Jai Lily Education Foundation and its founders, Mr Tung Chao-Yu and Mdm Ngai Chue-Jai Lily. I did not know them. I can only say what their gift now holds open.</w:t>
+      </w:r>
+    </w:p>
+    <w:p>
+      <w:pPr>
+        <w:spacing w:after="240" w:before="0" w:line="276" w:lineRule="auto"/>
+      </w:pPr>
+      <w:r>
+        <w:rPr>
+          <w:rFonts w:ascii="Times New Roman" w:hAnsi="Times New Roman"/>
+          <w:b w:val="0"/>
+          <w:i w:val="0"/>
+          <w:sz w:val="24"/>
+        </w:rPr>
+        <w:t>The Scholarship changes the next years in ordinary ways. Tuition and the living allowance let me stay in the work instead of stepping out of it. The exchange subsidy turns the compulsory Mainland programme from a visit into a working season — time inside a community and its health system, not a tour of either. After graduation I hope to serve at the Hong Kong–Mainland public-health interface, through a field placement with China CDC and, later, at the Centre for Health Protection. The Endeavour Support Fund I will use as start-up capital to build in public health in the Greater Bay Area.</w:t>
+      </w:r>
+    </w:p>
+    <w:p>
+      <w:pPr>
+        <w:spacing w:after="240" w:before="0" w:line="276" w:lineRule="auto"/>
+      </w:pPr>
+      <w:r>
+        <w:rPr>
+          <w:rFonts w:ascii="Times New Roman" w:hAnsi="Times New Roman"/>
+          <w:b w:val="0"/>
+          <w:i w:val="0"/>
+          <w:sz w:val="24"/>
+        </w:rPr>
+        <w:t>The scheme asks scholars to mentor those who follow. I will. I will keep showing up in Hong Kong — in halls, in classrooms, in community work that produces no certificate. A gift made for people the founders would never meet is repaid in work. I intend to do the work.</w:t>
+      </w:r>
+    </w:p>
+    <w:p>
+      <w:pPr>
+        <w:spacing w:after="720" w:before="0" w:line="276" w:lineRule="auto"/>
+      </w:pPr>
+      <w:r>
+        <w:rPr>
+          <w:rFonts w:ascii="Times New Roman" w:hAnsi="Times New Roman"/>
+          <w:b w:val="0"/>
+          <w:i w:val="0"/>
+          <w:sz w:val="24"/>
+        </w:rPr>
+        <w:t>Yours sincerely,</w:t>
+      </w:r>
+    </w:p>
+    <w:p>
+      <w:pPr>
+        <w:spacing w:after="0" w:before="0" w:line="276" w:lineRule="auto"/>
+      </w:pPr>
+      <w:r>
+        <w:rPr>
+          <w:rFonts w:ascii="Times New Roman" w:hAnsi="Times New Roman"/>
           <w:b w:val="0"/>
           <w:i w:val="0"/>
           <w:sz w:val="24"/>
@@ -19,12 +102,25 @@
     </w:p>
     <w:p>
       <w:pPr>
-        <w:spacing w:before="0" w:after="0" w:line="276" w:lineRule="auto"/>
-        <w:jc w:val="center"/>
+        <w:spacing w:after="0" w:before="0" w:line="276" w:lineRule="auto"/>
       </w:pPr>
       <w:r>
         <w:rPr>
-          <w:rFonts w:ascii="Times New Roman" w:hAnsi="Times New Roman" w:eastAsia="Times New Roman"/>
+          <w:rFonts w:ascii="Times New Roman" w:hAnsi="Times New Roman"/>
+          <w:b w:val="0"/>
+          <w:i w:val="0"/>
+          <w:sz w:val="24"/>
+        </w:rPr>
+        <w:t>The University of Hong Kong</w:t>
+      </w:r>
+    </w:p>
+    <w:p>
+      <w:pPr>
+        <w:spacing w:after="360" w:before="0" w:line="276" w:lineRule="auto"/>
+      </w:pPr>
+      <w:r>
+        <w:rPr>
+          <w:rFonts w:ascii="Times New Roman" w:hAnsi="Times New Roman"/>
           <w:b w:val="0"/>
           <w:i w:val="0"/>
           <w:sz w:val="24"/>
@@ -34,167 +130,11 @@
     </w:p>
     <w:p>
       <w:pPr>
-        <w:spacing w:before="0" w:after="0" w:line="276" w:lineRule="auto"/>
-        <w:jc w:val="center"/>
+        <w:spacing w:after="160" w:before="0" w:line="276" w:lineRule="auto"/>
       </w:pPr>
       <w:r>
         <w:rPr>
-          <w:rFonts w:ascii="Times New Roman" w:hAnsi="Times New Roman" w:eastAsia="Times New Roman"/>
-          <w:b w:val="0"/>
-          <w:i w:val="0"/>
-          <w:sz w:val="24"/>
-        </w:rPr>
-        <w:t>Bachelor of Arts and Sciences in Global Health and Development</w:t>
-      </w:r>
-    </w:p>
-    <w:p>
-      <w:pPr>
-        <w:spacing w:before="0" w:after="180" w:line="276" w:lineRule="auto"/>
-        <w:jc w:val="center"/>
-      </w:pPr>
-      <w:r>
-        <w:rPr>
-          <w:rFonts w:ascii="Times New Roman" w:hAnsi="Times New Roman" w:eastAsia="Times New Roman"/>
-          <w:b w:val="0"/>
-          <w:i w:val="0"/>
-          <w:sz w:val="24"/>
-        </w:rPr>
-        <w:t>The University of Hong Kong</w:t>
-      </w:r>
-    </w:p>
-    <w:p>
-      <w:pPr>
-        <w:spacing w:before="0" w:after="120" w:line="276" w:lineRule="auto"/>
-      </w:pPr>
-      <w:r>
-        <w:rPr>
-          <w:rFonts w:ascii="Times New Roman" w:hAnsi="Times New Roman" w:eastAsia="Times New Roman"/>
-          <w:b w:val="0"/>
-          <w:i w:val="0"/>
-          <w:sz w:val="24"/>
-        </w:rPr>
-        <w:t>Dear Professor Wong,</w:t>
-      </w:r>
-    </w:p>
-    <w:p>
-      <w:pPr>
-        <w:spacing w:before="0" w:after="120" w:line="276" w:lineRule="auto"/>
-      </w:pPr>
-      <w:r>
-        <w:rPr>
-          <w:rFonts w:ascii="Times New Roman" w:hAnsi="Times New Roman" w:eastAsia="Times New Roman"/>
-          <w:b w:val="0"/>
-          <w:i w:val="0"/>
-          <w:sz w:val="24"/>
-        </w:rPr>
-        <w:t>Thank you for selecting me for the Tung and Ngai Foundation Scholarship. Through you I thank the Tung Chao-Yu &amp; Ngai Chue Jai Lily Education Foundation, and the founders, Mr Tung Chao-Yu and Mdm Ngai Chue-Jai Lily.</w:t>
-      </w:r>
-    </w:p>
-    <w:p>
-      <w:pPr>
-        <w:spacing w:before="0" w:after="120" w:line="276" w:lineRule="auto"/>
-      </w:pPr>
-      <w:r>
-        <w:rPr>
-          <w:rFonts w:ascii="Times New Roman" w:hAnsi="Times New Roman" w:eastAsia="Times New Roman"/>
-          <w:b w:val="0"/>
-          <w:i w:val="0"/>
-          <w:sz w:val="24"/>
-        </w:rPr>
-        <w:t>I want to work at the Hong Kong–Mainland public-health interface: a field placement with China CDC during my degree, and later the Centre for Health Protection. The tuition and living allowance let me stay in my studies and in that work. The exchange subsidy lets me take the compulsory Mainland programme as time to learn there, and to understand the place better. The Endeavour Support Fund is start-up capital for the Greater Bay Area or the Mainland. I will use it to build in public health.</w:t>
-      </w:r>
-    </w:p>
-    <w:p>
-      <w:pPr>
-        <w:spacing w:before="0" w:after="120" w:line="276" w:lineRule="auto"/>
-      </w:pPr>
-      <w:r>
-        <w:rPr>
-          <w:rFonts w:ascii="Times New Roman" w:hAnsi="Times New Roman" w:eastAsia="Times New Roman"/>
-          <w:b w:val="0"/>
-          <w:i w:val="0"/>
-          <w:sz w:val="24"/>
-        </w:rPr>
-        <w:t>I applied for this scholarship before the summer. What I can now show you is the work this summer. I spent two weeks in Macha Village, Gansu, on an HKU Horizons and Wu Zhi Qiao service-learning programme, as a student coordinator, after a visit in Shaanxi. We lived in the village. In groups we studied how water is managed on dry loess land, how rammed-earth houses are built, and how families live and eat. We also did the physical work of rural infrastructure. One of those jobs was installing solar street lamps. My job was to help the team be useful—logistics, listening, and understanding the local context of the village. At the Nansen East-West Dialogue Academy in Lillehammer I was among students from east and west whose task was to understand each other well enough to help each other. That is the task of public health when two systems have to act together.</w:t>
-      </w:r>
-    </w:p>
-    <w:p>
-      <w:pPr>
-        <w:spacing w:before="0" w:after="120" w:line="276" w:lineRule="auto"/>
-      </w:pPr>
-      <w:r>
-        <w:rPr>
-          <w:rFonts w:ascii="Times New Roman" w:hAnsi="Times New Roman" w:eastAsia="Times New Roman"/>
-          <w:b w:val="0"/>
-          <w:i w:val="0"/>
-          <w:sz w:val="24"/>
-        </w:rPr>
-        <w:t>The scheme asks scholars to mentor those who follow. I will. I will also keep serving in Hong Kong and the Mainland. A gift made for people the founders would never meet is repaid in work. I intend to do the work.</w:t>
-      </w:r>
-    </w:p>
-    <w:p>
-      <w:pPr>
-        <w:spacing w:before="0" w:after="240" w:line="276" w:lineRule="auto"/>
-      </w:pPr>
-      <w:r>
-        <w:rPr>
-          <w:rFonts w:ascii="Times New Roman" w:hAnsi="Times New Roman" w:eastAsia="Times New Roman"/>
-          <w:b w:val="0"/>
-          <w:i w:val="0"/>
-          <w:sz w:val="24"/>
-        </w:rPr>
-        <w:t>Yours sincerely,</w:t>
-      </w:r>
-    </w:p>
-    <w:p>
-      <w:pPr>
-        <w:spacing w:before="0" w:after="0" w:line="276" w:lineRule="auto"/>
-      </w:pPr>
-      <w:r>
-        <w:rPr>
-          <w:rFonts w:ascii="Times New Roman" w:hAnsi="Times New Roman" w:eastAsia="Times New Roman"/>
-          <w:b w:val="0"/>
-          <w:i w:val="0"/>
-          <w:sz w:val="24"/>
-        </w:rPr>
-        <w:t>SHEN Ruililin</w:t>
-      </w:r>
-    </w:p>
-    <w:p>
-      <w:pPr>
-        <w:spacing w:before="0" w:after="0" w:line="276" w:lineRule="auto"/>
-      </w:pPr>
-      <w:r>
-        <w:rPr>
-          <w:rFonts w:ascii="Times New Roman" w:hAnsi="Times New Roman" w:eastAsia="Times New Roman"/>
-          <w:b w:val="0"/>
-          <w:i w:val="0"/>
-          <w:sz w:val="24"/>
-        </w:rPr>
-        <w:t>The University of Hong Kong</w:t>
-      </w:r>
-    </w:p>
-    <w:p>
-      <w:pPr>
-        <w:spacing w:before="0" w:after="180" w:line="276" w:lineRule="auto"/>
-      </w:pPr>
-      <w:r>
-        <w:rPr>
-          <w:rFonts w:ascii="Times New Roman" w:hAnsi="Times New Roman" w:eastAsia="Times New Roman"/>
-          <w:b w:val="0"/>
-          <w:i w:val="0"/>
-          <w:sz w:val="24"/>
-        </w:rPr>
-        <w:t>University Number: 3036484434</w:t>
-      </w:r>
-    </w:p>
-    <w:p>
-      <w:pPr>
-        <w:spacing w:before="0" w:after="80" w:line="276" w:lineRule="auto"/>
-      </w:pPr>
-      <w:r>
-        <w:rPr>
-          <w:rFonts w:ascii="Times New Roman" w:hAnsi="Times New Roman" w:eastAsia="Times New Roman"/>
+          <w:rFonts w:ascii="Times New Roman" w:hAnsi="Times New Roman"/>
           <w:b/>
           <w:i w:val="0"/>
           <w:sz w:val="24"/>
@@ -204,44 +144,30 @@
     </w:p>
     <w:p>
       <w:pPr>
-        <w:spacing w:before="0" w:after="80" w:line="276" w:lineRule="auto"/>
+        <w:spacing w:after="160" w:before="0" w:line="276" w:lineRule="auto"/>
       </w:pPr>
       <w:r>
         <w:rPr>
-          <w:rFonts w:ascii="Times New Roman" w:hAnsi="Times New Roman" w:eastAsia="Times New Roman"/>
+          <w:rFonts w:ascii="Times New Roman" w:hAnsi="Times New Roman"/>
           <w:b w:val="0"/>
           <w:i w:val="0"/>
           <w:sz w:val="24"/>
         </w:rPr>
-        <w:t>Figure 1. Macha Village, Gansu, June 2026. Installing solar street lamps as part of Wu Zhi Qiao.</w:t>
+        <w:t>Figure 1. Macha Village, Gansu, June 2026. Digging during Wu Zhi Qiao’s solar street-lamp project. I am the one with the shovel.</w:t>
       </w:r>
     </w:p>
     <w:p>
       <w:pPr>
-        <w:spacing w:before="0" w:after="80" w:line="276" w:lineRule="auto"/>
+        <w:spacing w:after="160" w:before="0" w:line="276" w:lineRule="auto"/>
       </w:pPr>
       <w:r>
         <w:rPr>
-          <w:rFonts w:ascii="Times New Roman" w:hAnsi="Times New Roman" w:eastAsia="Times New Roman"/>
+          <w:rFonts w:ascii="Times New Roman" w:hAnsi="Times New Roman"/>
           <w:b w:val="0"/>
           <w:i w:val="0"/>
           <w:sz w:val="24"/>
         </w:rPr>
-        <w:t>Figure 2. Nansen Academy, Lillehammer, Norway, August 2026. Talking with Steinar Bryn.</w:t>
-      </w:r>
-    </w:p>
-    <w:p>
-      <w:pPr>
-        <w:spacing w:before="0" w:after="0" w:line="276" w:lineRule="auto"/>
-      </w:pPr>
-      <w:r>
-        <w:rPr>
-          <w:rFonts w:ascii="Times New Roman" w:hAnsi="Times New Roman" w:eastAsia="Times New Roman"/>
-          <w:b w:val="0"/>
-          <w:i/>
-          <w:sz w:val="20"/>
-        </w:rPr>
-        <w:t>[Delete before sending. Body word count 318. If a photograph is a group shot, say which person you are.]</w:t>
+        <w:t>Figure 2. Nansen East-West Dialogue Academy (NEWDAY), Lillehammer, August 2026. Evening at Steinar Bryn’s home. I am in the centre, black polo. Steinar Bryn is on the left.</w:t>
       </w:r>
     </w:p>
     <w:sectPr>

</xml_diff>